<commit_message>
add german notes A2
</commit_message>
<xml_diff>
--- a/A2/Adjective.docx
+++ b/A2/Adjective.docx
@@ -25,6 +25,55 @@
           <w:bCs/>
         </w:rPr>
         <w:t xml:space="preserve"> — huge / enormous</w:t>
+      </w:r>
+    </w:p>
+    <w:p>
+      <w:pPr>
+        <w:pStyle w:val="ListParagraph"/>
+        <w:numPr>
+          <w:ilvl w:val="0"/>
+          <w:numId w:val="1"/>
+        </w:numPr>
+      </w:pPr>
+      <w:proofErr w:type="spellStart"/>
+      <w:r>
+        <w:rPr>
+          <w:b/>
+          <w:bCs/>
+        </w:rPr>
+        <w:t>eindeutig</w:t>
+      </w:r>
+      <w:proofErr w:type="spellEnd"/>
+      <w:r>
+        <w:t xml:space="preserve"> – clear</w:t>
+      </w:r>
+    </w:p>
+    <w:p>
+      <w:pPr>
+        <w:pStyle w:val="ListParagraph"/>
+        <w:numPr>
+          <w:ilvl w:val="0"/>
+          <w:numId w:val="1"/>
+        </w:numPr>
+      </w:pPr>
+      <w:r>
+        <w:rPr>
+          <w:b/>
+          <w:bCs/>
+        </w:rPr>
+        <w:t xml:space="preserve">die </w:t>
+      </w:r>
+      <w:proofErr w:type="spellStart"/>
+      <w:r>
+        <w:rPr>
+          <w:b/>
+          <w:bCs/>
+        </w:rPr>
+        <w:t>Reife</w:t>
+      </w:r>
+      <w:proofErr w:type="spellEnd"/>
+      <w:r>
+        <w:t xml:space="preserve"> – (no plural) – the ripeness, the maturity</w:t>
       </w:r>
     </w:p>
     <w:sectPr>

</xml_diff>

<commit_message>
add notes from A2
</commit_message>
<xml_diff>
--- a/A2/Adjective.docx
+++ b/A2/Adjective.docx
@@ -74,6 +74,27 @@
       <w:proofErr w:type="spellEnd"/>
       <w:r>
         <w:t xml:space="preserve"> – (no plural) – the ripeness, the maturity</w:t>
+      </w:r>
+    </w:p>
+    <w:p>
+      <w:pPr>
+        <w:pStyle w:val="ListParagraph"/>
+        <w:numPr>
+          <w:ilvl w:val="0"/>
+          <w:numId w:val="1"/>
+        </w:numPr>
+      </w:pPr>
+      <w:proofErr w:type="spellStart"/>
+      <w:r>
+        <w:rPr>
+          <w:b/>
+          <w:bCs/>
+        </w:rPr>
+        <w:t>durchschnittlich</w:t>
+      </w:r>
+      <w:proofErr w:type="spellEnd"/>
+      <w:r>
+        <w:t xml:space="preserve"> – adjective/adverb – average, on average</w:t>
       </w:r>
     </w:p>
     <w:sectPr>

</xml_diff>

<commit_message>
add reflexive verbs and lesson 5 it was hell
</commit_message>
<xml_diff>
--- a/A2/Adjective.docx
+++ b/A2/Adjective.docx
@@ -97,6 +97,43 @@
         <w:t xml:space="preserve"> – adjective/adverb – average, on average</w:t>
       </w:r>
     </w:p>
+    <w:p>
+      <w:pPr>
+        <w:pStyle w:val="ListParagraph"/>
+        <w:numPr>
+          <w:ilvl w:val="0"/>
+          <w:numId w:val="1"/>
+        </w:numPr>
+      </w:pPr>
+      <w:proofErr w:type="spellStart"/>
+      <w:r>
+        <w:rPr>
+          <w:b/>
+          <w:bCs/>
+        </w:rPr>
+        <w:t>tabellarisch</w:t>
+      </w:r>
+      <w:proofErr w:type="spellEnd"/>
+      <w:r>
+        <w:t xml:space="preserve"> — tabular / in table form — </w:t>
+      </w:r>
+      <w:r>
+        <w:rPr>
+          <w:b/>
+          <w:bCs/>
+        </w:rPr>
+        <w:t>(adjective)</w:t>
+      </w:r>
+    </w:p>
+    <w:p>
+      <w:pPr>
+        <w:pStyle w:val="ListParagraph"/>
+        <w:numPr>
+          <w:ilvl w:val="0"/>
+          <w:numId w:val="1"/>
+        </w:numPr>
+      </w:pPr>
+    </w:p>
     <w:sectPr>
       <w:pgSz w:w="11906" w:h="16838"/>
       <w:pgMar w:top="1417" w:right="1417" w:bottom="1134" w:left="1417" w:header="720" w:footer="720" w:gutter="0"/>
@@ -110,6 +147,119 @@
 <file path=word/numbering.xml><?xml version="1.0" encoding="utf-8"?>
 <w:numbering xmlns:wpc="http://schemas.microsoft.com/office/word/2010/wordprocessingCanvas" xmlns:cx="http://schemas.microsoft.com/office/drawing/2014/chartex" xmlns:cx1="http://schemas.microsoft.com/office/drawing/2015/9/8/chartex" xmlns:cx2="http://schemas.microsoft.com/office/drawing/2015/10/21/chartex" xmlns:cx3="http://schemas.microsoft.com/office/drawing/2016/5/9/chartex" xmlns:cx4="http://schemas.microsoft.com/office/drawing/2016/5/10/chartex" xmlns:cx5="http://schemas.microsoft.com/office/drawing/2016/5/11/chartex" xmlns:cx6="http://schemas.microsoft.com/office/drawing/2016/5/12/chartex" xmlns:cx7="http://schemas.microsoft.com/office/drawing/2016/5/13/chartex" xmlns:cx8="http://schemas.microsoft.com/office/drawing/2016/5/14/chartex" xmlns:mc="http://schemas.openxmlformats.org/markup-compatibility/2006" xmlns:aink="http://schemas.microsoft.com/office/drawing/2016/ink" xmlns:am3d="http://schemas.microsoft.com/office/drawing/2017/model3d" xmlns:o="urn:schemas-microsoft-com:office:office" xmlns:oel="http://schemas.microsoft.com/office/2019/extlst" xmlns:r="http://schemas.openxmlformats.org/officeDocument/2006/relationships" xmlns:m="http://schemas.openxmlformats.org/officeDocument/2006/math" xmlns:v="urn:schemas-microsoft-com:vml" xmlns:wp14="http://schemas.microsoft.com/office/word/2010/wordprocessingDrawing" xmlns:wp="http://schemas.openxmlformats.org/drawingml/2006/wordprocessingDrawing" xmlns:w10="urn:schemas-microsoft-com:office:word" xmlns:w="http://schemas.openxmlformats.org/wordprocessingml/2006/main" xmlns:w14="http://schemas.microsoft.com/office/word/2010/wordml" xmlns:w15="http://schemas.microsoft.com/office/word/2012/wordml" xmlns:w16cex="http://schemas.microsoft.com/office/word/2018/wordml/cex" xmlns:w16cid="http://schemas.microsoft.com/office/word/2016/wordml/cid" xmlns:w16="http://schemas.microsoft.com/office/word/2018/wordml" xmlns:w16du="http://schemas.microsoft.com/office/word/2023/wordml/word16du" xmlns:w16sdtdh="http://schemas.microsoft.com/office/word/2020/wordml/sdtdatahash" xmlns:w16sdtfl="http://schemas.microsoft.com/office/word/2024/wordml/sdtformatlock" xmlns:w16se="http://schemas.microsoft.com/office/word/2015/wordml/symex" xmlns:wpg="http://schemas.microsoft.com/office/word/2010/wordprocessingGroup" xmlns:wpi="http://schemas.microsoft.com/office/word/2010/wordprocessingInk" xmlns:wne="http://schemas.microsoft.com/office/word/2006/wordml" xmlns:wps="http://schemas.microsoft.com/office/word/2010/wordprocessingShape" mc:Ignorable="w14 w15 w16se w16cid w16 w16cex w16sdtdh w16sdtfl w16du wp14">
   <w:abstractNum w:abstractNumId="0" w15:restartNumberingAfterBreak="0">
+    <w:nsid w:val="1C5F14F6"/>
+    <w:multiLevelType w:val="hybridMultilevel"/>
+    <w:tmpl w:val="DF5A3540"/>
+    <w:lvl w:ilvl="0" w:tplc="0C090001">
+      <w:start w:val="1"/>
+      <w:numFmt w:val="bullet"/>
+      <w:lvlText w:val=""/>
+      <w:lvlJc w:val="left"/>
+      <w:pPr>
+        <w:ind w:left="720" w:hanging="360"/>
+      </w:pPr>
+      <w:rPr>
+        <w:rFonts w:ascii="Symbol" w:hAnsi="Symbol" w:hint="default"/>
+      </w:rPr>
+    </w:lvl>
+    <w:lvl w:ilvl="1" w:tplc="0C090003" w:tentative="1">
+      <w:start w:val="1"/>
+      <w:numFmt w:val="bullet"/>
+      <w:lvlText w:val="o"/>
+      <w:lvlJc w:val="left"/>
+      <w:pPr>
+        <w:ind w:left="1440" w:hanging="360"/>
+      </w:pPr>
+      <w:rPr>
+        <w:rFonts w:ascii="Courier New" w:hAnsi="Courier New" w:cs="Courier New" w:hint="default"/>
+      </w:rPr>
+    </w:lvl>
+    <w:lvl w:ilvl="2" w:tplc="0C090005" w:tentative="1">
+      <w:start w:val="1"/>
+      <w:numFmt w:val="bullet"/>
+      <w:lvlText w:val=""/>
+      <w:lvlJc w:val="left"/>
+      <w:pPr>
+        <w:ind w:left="2160" w:hanging="360"/>
+      </w:pPr>
+      <w:rPr>
+        <w:rFonts w:ascii="Wingdings" w:hAnsi="Wingdings" w:hint="default"/>
+      </w:rPr>
+    </w:lvl>
+    <w:lvl w:ilvl="3" w:tplc="0C090001" w:tentative="1">
+      <w:start w:val="1"/>
+      <w:numFmt w:val="bullet"/>
+      <w:lvlText w:val=""/>
+      <w:lvlJc w:val="left"/>
+      <w:pPr>
+        <w:ind w:left="2880" w:hanging="360"/>
+      </w:pPr>
+      <w:rPr>
+        <w:rFonts w:ascii="Symbol" w:hAnsi="Symbol" w:hint="default"/>
+      </w:rPr>
+    </w:lvl>
+    <w:lvl w:ilvl="4" w:tplc="0C090003" w:tentative="1">
+      <w:start w:val="1"/>
+      <w:numFmt w:val="bullet"/>
+      <w:lvlText w:val="o"/>
+      <w:lvlJc w:val="left"/>
+      <w:pPr>
+        <w:ind w:left="3600" w:hanging="360"/>
+      </w:pPr>
+      <w:rPr>
+        <w:rFonts w:ascii="Courier New" w:hAnsi="Courier New" w:cs="Courier New" w:hint="default"/>
+      </w:rPr>
+    </w:lvl>
+    <w:lvl w:ilvl="5" w:tplc="0C090005" w:tentative="1">
+      <w:start w:val="1"/>
+      <w:numFmt w:val="bullet"/>
+      <w:lvlText w:val=""/>
+      <w:lvlJc w:val="left"/>
+      <w:pPr>
+        <w:ind w:left="4320" w:hanging="360"/>
+      </w:pPr>
+      <w:rPr>
+        <w:rFonts w:ascii="Wingdings" w:hAnsi="Wingdings" w:hint="default"/>
+      </w:rPr>
+    </w:lvl>
+    <w:lvl w:ilvl="6" w:tplc="0C090001" w:tentative="1">
+      <w:start w:val="1"/>
+      <w:numFmt w:val="bullet"/>
+      <w:lvlText w:val=""/>
+      <w:lvlJc w:val="left"/>
+      <w:pPr>
+        <w:ind w:left="5040" w:hanging="360"/>
+      </w:pPr>
+      <w:rPr>
+        <w:rFonts w:ascii="Symbol" w:hAnsi="Symbol" w:hint="default"/>
+      </w:rPr>
+    </w:lvl>
+    <w:lvl w:ilvl="7" w:tplc="0C090003" w:tentative="1">
+      <w:start w:val="1"/>
+      <w:numFmt w:val="bullet"/>
+      <w:lvlText w:val="o"/>
+      <w:lvlJc w:val="left"/>
+      <w:pPr>
+        <w:ind w:left="5760" w:hanging="360"/>
+      </w:pPr>
+      <w:rPr>
+        <w:rFonts w:ascii="Courier New" w:hAnsi="Courier New" w:cs="Courier New" w:hint="default"/>
+      </w:rPr>
+    </w:lvl>
+    <w:lvl w:ilvl="8" w:tplc="0C090005" w:tentative="1">
+      <w:start w:val="1"/>
+      <w:numFmt w:val="bullet"/>
+      <w:lvlText w:val=""/>
+      <w:lvlJc w:val="left"/>
+      <w:pPr>
+        <w:ind w:left="6480" w:hanging="360"/>
+      </w:pPr>
+      <w:rPr>
+        <w:rFonts w:ascii="Wingdings" w:hAnsi="Wingdings" w:hint="default"/>
+      </w:rPr>
+    </w:lvl>
+  </w:abstractNum>
+  <w:abstractNum w:abstractNumId="1" w15:restartNumberingAfterBreak="0">
     <w:nsid w:val="3C2B0D6D"/>
     <w:multiLevelType w:val="hybridMultilevel"/>
     <w:tmpl w:val="5C966666"/>
@@ -223,6 +373,9 @@
     </w:lvl>
   </w:abstractNum>
   <w:num w:numId="1" w16cid:durableId="1850171870">
+    <w:abstractNumId w:val="1"/>
+  </w:num>
+  <w:num w:numId="2" w16cid:durableId="675888018">
     <w:abstractNumId w:val="0"/>
   </w:num>
 </w:numbering>

</xml_diff>

<commit_message>
add chapter 6 A2
</commit_message>
<xml_diff>
--- a/A2/Adjective.docx
+++ b/A2/Adjective.docx
@@ -10,21 +10,12 @@
           <w:numId w:val="1"/>
         </w:numPr>
       </w:pPr>
-      <w:proofErr w:type="spellStart"/>
       <w:r>
         <w:rPr>
           <w:b/>
           <w:bCs/>
         </w:rPr>
-        <w:t>riesig</w:t>
-      </w:r>
-      <w:proofErr w:type="spellEnd"/>
-      <w:r>
-        <w:rPr>
-          <w:b/>
-          <w:bCs/>
-        </w:rPr>
-        <w:t xml:space="preserve"> — huge / enormous</w:t>
+        <w:t>riesig — huge / enormous</w:t>
       </w:r>
     </w:p>
     <w:p>
@@ -35,7 +26,6 @@
           <w:numId w:val="1"/>
         </w:numPr>
       </w:pPr>
-      <w:proofErr w:type="spellStart"/>
       <w:r>
         <w:rPr>
           <w:b/>
@@ -43,7 +33,6 @@
         </w:rPr>
         <w:t>eindeutig</w:t>
       </w:r>
-      <w:proofErr w:type="spellEnd"/>
       <w:r>
         <w:t xml:space="preserve"> – clear</w:t>
       </w:r>
@@ -61,17 +50,8 @@
           <w:b/>
           <w:bCs/>
         </w:rPr>
-        <w:t xml:space="preserve">die </w:t>
-      </w:r>
-      <w:proofErr w:type="spellStart"/>
-      <w:r>
-        <w:rPr>
-          <w:b/>
-          <w:bCs/>
-        </w:rPr>
-        <w:t>Reife</w:t>
-      </w:r>
-      <w:proofErr w:type="spellEnd"/>
+        <w:t>die Reife</w:t>
+      </w:r>
       <w:r>
         <w:t xml:space="preserve"> – (no plural) – the ripeness, the maturity</w:t>
       </w:r>
@@ -84,7 +64,6 @@
           <w:numId w:val="1"/>
         </w:numPr>
       </w:pPr>
-      <w:proofErr w:type="spellStart"/>
       <w:r>
         <w:rPr>
           <w:b/>
@@ -92,7 +71,6 @@
         </w:rPr>
         <w:t>durchschnittlich</w:t>
       </w:r>
-      <w:proofErr w:type="spellEnd"/>
       <w:r>
         <w:t xml:space="preserve"> – adjective/adverb – average, on average</w:t>
       </w:r>
@@ -105,7 +83,6 @@
           <w:numId w:val="1"/>
         </w:numPr>
       </w:pPr>
-      <w:proofErr w:type="spellStart"/>
       <w:r>
         <w:rPr>
           <w:b/>
@@ -113,7 +90,6 @@
         </w:rPr>
         <w:t>tabellarisch</w:t>
       </w:r>
-      <w:proofErr w:type="spellEnd"/>
       <w:r>
         <w:t xml:space="preserve"> — tabular / in table form — </w:t>
       </w:r>
@@ -133,6 +109,130 @@
           <w:numId w:val="1"/>
         </w:numPr>
       </w:pPr>
+      <w:r>
+        <w:rPr>
+          <w:b/>
+          <w:bCs/>
+        </w:rPr>
+        <w:t>berühmt</w:t>
+      </w:r>
+      <w:r>
+        <w:t xml:space="preserve"> – adjective – famous, well-known</w:t>
+      </w:r>
+    </w:p>
+    <w:p>
+      <w:pPr>
+        <w:pStyle w:val="ListParagraph"/>
+        <w:numPr>
+          <w:ilvl w:val="0"/>
+          <w:numId w:val="1"/>
+        </w:numPr>
+      </w:pPr>
+      <w:r>
+        <w:rPr>
+          <w:b/>
+          <w:bCs/>
+        </w:rPr>
+        <w:t>erfolgreich</w:t>
+      </w:r>
+      <w:r>
+        <w:t xml:space="preserve"> – adjective/adverb – successful, successfully</w:t>
+      </w:r>
+    </w:p>
+    <w:p>
+      <w:pPr>
+        <w:pStyle w:val="ListParagraph"/>
+        <w:numPr>
+          <w:ilvl w:val="0"/>
+          <w:numId w:val="1"/>
+        </w:numPr>
+      </w:pPr>
+      <w:r>
+        <w:rPr>
+          <w:b/>
+          <w:bCs/>
+        </w:rPr>
+        <w:t>liebevoll</w:t>
+      </w:r>
+      <w:r>
+        <w:t xml:space="preserve"> – adjective/adverb – loving, affectionate, loving-careful</w:t>
+      </w:r>
+    </w:p>
+    <w:p>
+      <w:pPr>
+        <w:pStyle w:val="ListParagraph"/>
+        <w:numPr>
+          <w:ilvl w:val="0"/>
+          <w:numId w:val="1"/>
+        </w:numPr>
+      </w:pPr>
+      <w:r>
+        <w:rPr>
+          <w:b/>
+          <w:bCs/>
+        </w:rPr>
+        <w:t>sinnvoll</w:t>
+      </w:r>
+      <w:r>
+        <w:t xml:space="preserve"> – adjective/adverb – sensible, meaningful, useful, purposeful</w:t>
+      </w:r>
+    </w:p>
+    <w:p>
+      <w:pPr>
+        <w:pStyle w:val="ListParagraph"/>
+        <w:numPr>
+          <w:ilvl w:val="0"/>
+          <w:numId w:val="1"/>
+        </w:numPr>
+      </w:pPr>
+      <w:r>
+        <w:rPr>
+          <w:b/>
+          <w:bCs/>
+        </w:rPr>
+        <w:t>dauerhaft</w:t>
+      </w:r>
+      <w:r>
+        <w:t xml:space="preserve"> – adjective/adverb – permanent, lasting, durable, long-term</w:t>
+      </w:r>
+    </w:p>
+    <w:p>
+      <w:pPr>
+        <w:pStyle w:val="ListParagraph"/>
+        <w:numPr>
+          <w:ilvl w:val="0"/>
+          <w:numId w:val="1"/>
+        </w:numPr>
+      </w:pPr>
+      <w:r>
+        <w:rPr>
+          <w:b/>
+          <w:bCs/>
+        </w:rPr>
+        <w:t>umgekehrt</w:t>
+      </w:r>
+      <w:r>
+        <w:t xml:space="preserve"> – adjective/adverb – reversed, the other way round, vice versa, inversely</w:t>
+      </w:r>
+    </w:p>
+    <w:p>
+      <w:pPr>
+        <w:pStyle w:val="ListParagraph"/>
+        <w:numPr>
+          <w:ilvl w:val="0"/>
+          <w:numId w:val="1"/>
+        </w:numPr>
+      </w:pPr>
+      <w:r>
+        <w:rPr>
+          <w:b/>
+          <w:bCs/>
+        </w:rPr>
+        <w:t>böse</w:t>
+      </w:r>
+      <w:r>
+        <w:t xml:space="preserve"> – adjective – evil, wicked, angry, bad</w:t>
+      </w:r>
     </w:p>
     <w:sectPr>
       <w:pgSz w:w="11906" w:h="16838"/>
@@ -262,7 +362,7 @@
   <w:abstractNum w:abstractNumId="1" w15:restartNumberingAfterBreak="0">
     <w:nsid w:val="3C2B0D6D"/>
     <w:multiLevelType w:val="hybridMultilevel"/>
-    <w:tmpl w:val="5C966666"/>
+    <w:tmpl w:val="2D5ED6F8"/>
     <w:lvl w:ilvl="0" w:tplc="0C090001">
       <w:start w:val="1"/>
       <w:numFmt w:val="bullet"/>
@@ -1296,6 +1396,32 @@
       <w:spacing w:val="5"/>
     </w:rPr>
   </w:style>
+  <w:style w:type="paragraph" w:customStyle="1" w:styleId="ds-markdown-paragraph">
+    <w:name w:val="ds-markdown-paragraph"/>
+    <w:basedOn w:val="Normal"/>
+    <w:rsid w:val="004A7622"/>
+    <w:pPr>
+      <w:spacing w:before="100" w:beforeAutospacing="1" w:after="100" w:afterAutospacing="1" w:line="240" w:lineRule="auto"/>
+    </w:pPr>
+    <w:rPr>
+      <w:rFonts w:ascii="Times New Roman" w:eastAsia="Times New Roman" w:hAnsi="Times New Roman" w:cs="Times New Roman"/>
+      <w:sz w:val="24"/>
+      <w:szCs w:val="24"/>
+      <w:lang w:eastAsia="en-AU"/>
+      <w14:ligatures w14:val="none"/>
+    </w:rPr>
+  </w:style>
+  <w:style w:type="character" w:styleId="Strong">
+    <w:name w:val="Strong"/>
+    <w:basedOn w:val="DefaultParagraphFont"/>
+    <w:uiPriority w:val="22"/>
+    <w:qFormat/>
+    <w:rsid w:val="004A7622"/>
+    <w:rPr>
+      <w:b/>
+      <w:bCs/>
+    </w:rPr>
+  </w:style>
 </w:styles>
 </file>
 

</xml_diff>

<commit_message>
update the A2 notes
</commit_message>
<xml_diff>
--- a/A2/Adjective.docx
+++ b/A2/Adjective.docx
@@ -10,12 +10,21 @@
           <w:numId w:val="1"/>
         </w:numPr>
       </w:pPr>
-      <w:r>
-        <w:rPr>
-          <w:b/>
-          <w:bCs/>
-        </w:rPr>
-        <w:t>riesig — huge / enormous</w:t>
+      <w:proofErr w:type="spellStart"/>
+      <w:r>
+        <w:rPr>
+          <w:b/>
+          <w:bCs/>
+        </w:rPr>
+        <w:t>riesig</w:t>
+      </w:r>
+      <w:proofErr w:type="spellEnd"/>
+      <w:r>
+        <w:rPr>
+          <w:b/>
+          <w:bCs/>
+        </w:rPr>
+        <w:t xml:space="preserve"> — huge / enormous</w:t>
       </w:r>
     </w:p>
     <w:p>
@@ -26,6 +35,7 @@
           <w:numId w:val="1"/>
         </w:numPr>
       </w:pPr>
+      <w:proofErr w:type="spellStart"/>
       <w:r>
         <w:rPr>
           <w:b/>
@@ -33,6 +43,7 @@
         </w:rPr>
         <w:t>eindeutig</w:t>
       </w:r>
+      <w:proofErr w:type="spellEnd"/>
       <w:r>
         <w:t xml:space="preserve"> – clear</w:t>
       </w:r>
@@ -50,8 +61,17 @@
           <w:b/>
           <w:bCs/>
         </w:rPr>
-        <w:t>die Reife</w:t>
-      </w:r>
+        <w:t xml:space="preserve">die </w:t>
+      </w:r>
+      <w:proofErr w:type="spellStart"/>
+      <w:r>
+        <w:rPr>
+          <w:b/>
+          <w:bCs/>
+        </w:rPr>
+        <w:t>Reife</w:t>
+      </w:r>
+      <w:proofErr w:type="spellEnd"/>
       <w:r>
         <w:t xml:space="preserve"> – (no plural) – the ripeness, the maturity</w:t>
       </w:r>
@@ -64,6 +84,7 @@
           <w:numId w:val="1"/>
         </w:numPr>
       </w:pPr>
+      <w:proofErr w:type="spellStart"/>
       <w:r>
         <w:rPr>
           <w:b/>
@@ -71,6 +92,7 @@
         </w:rPr>
         <w:t>durchschnittlich</w:t>
       </w:r>
+      <w:proofErr w:type="spellEnd"/>
       <w:r>
         <w:t xml:space="preserve"> – adjective/adverb – average, on average</w:t>
       </w:r>
@@ -83,6 +105,7 @@
           <w:numId w:val="1"/>
         </w:numPr>
       </w:pPr>
+      <w:proofErr w:type="spellStart"/>
       <w:r>
         <w:rPr>
           <w:b/>
@@ -90,6 +113,7 @@
         </w:rPr>
         <w:t>tabellarisch</w:t>
       </w:r>
+      <w:proofErr w:type="spellEnd"/>
       <w:r>
         <w:t xml:space="preserve"> — tabular / in table form — </w:t>
       </w:r>
@@ -109,6 +133,7 @@
           <w:numId w:val="1"/>
         </w:numPr>
       </w:pPr>
+      <w:proofErr w:type="spellStart"/>
       <w:r>
         <w:rPr>
           <w:b/>
@@ -116,6 +141,7 @@
         </w:rPr>
         <w:t>berühmt</w:t>
       </w:r>
+      <w:proofErr w:type="spellEnd"/>
       <w:r>
         <w:t xml:space="preserve"> – adjective – famous, well-known</w:t>
       </w:r>
@@ -128,6 +154,7 @@
           <w:numId w:val="1"/>
         </w:numPr>
       </w:pPr>
+      <w:proofErr w:type="spellStart"/>
       <w:r>
         <w:rPr>
           <w:b/>
@@ -135,6 +162,7 @@
         </w:rPr>
         <w:t>erfolgreich</w:t>
       </w:r>
+      <w:proofErr w:type="spellEnd"/>
       <w:r>
         <w:t xml:space="preserve"> – adjective/adverb – successful, successfully</w:t>
       </w:r>
@@ -147,6 +175,7 @@
           <w:numId w:val="1"/>
         </w:numPr>
       </w:pPr>
+      <w:proofErr w:type="spellStart"/>
       <w:r>
         <w:rPr>
           <w:b/>
@@ -154,6 +183,7 @@
         </w:rPr>
         <w:t>liebevoll</w:t>
       </w:r>
+      <w:proofErr w:type="spellEnd"/>
       <w:r>
         <w:t xml:space="preserve"> – adjective/adverb – loving, affectionate, loving-careful</w:t>
       </w:r>
@@ -166,6 +196,7 @@
           <w:numId w:val="1"/>
         </w:numPr>
       </w:pPr>
+      <w:proofErr w:type="spellStart"/>
       <w:r>
         <w:rPr>
           <w:b/>
@@ -173,6 +204,7 @@
         </w:rPr>
         <w:t>sinnvoll</w:t>
       </w:r>
+      <w:proofErr w:type="spellEnd"/>
       <w:r>
         <w:t xml:space="preserve"> – adjective/adverb – sensible, meaningful, useful, purposeful</w:t>
       </w:r>
@@ -185,6 +217,7 @@
           <w:numId w:val="1"/>
         </w:numPr>
       </w:pPr>
+      <w:proofErr w:type="spellStart"/>
       <w:r>
         <w:rPr>
           <w:b/>
@@ -192,6 +225,7 @@
         </w:rPr>
         <w:t>dauerhaft</w:t>
       </w:r>
+      <w:proofErr w:type="spellEnd"/>
       <w:r>
         <w:t xml:space="preserve"> – adjective/adverb – permanent, lasting, durable, long-term</w:t>
       </w:r>
@@ -204,6 +238,7 @@
           <w:numId w:val="1"/>
         </w:numPr>
       </w:pPr>
+      <w:proofErr w:type="spellStart"/>
       <w:r>
         <w:rPr>
           <w:b/>
@@ -211,6 +246,7 @@
         </w:rPr>
         <w:t>umgekehrt</w:t>
       </w:r>
+      <w:proofErr w:type="spellEnd"/>
       <w:r>
         <w:t xml:space="preserve"> – adjective/adverb – reversed, the other way round, vice versa, inversely</w:t>
       </w:r>
@@ -223,6 +259,7 @@
           <w:numId w:val="1"/>
         </w:numPr>
       </w:pPr>
+      <w:proofErr w:type="spellStart"/>
       <w:r>
         <w:rPr>
           <w:b/>
@@ -230,6 +267,7 @@
         </w:rPr>
         <w:t>böse</w:t>
       </w:r>
+      <w:proofErr w:type="spellEnd"/>
       <w:r>
         <w:t xml:space="preserve"> – adjective – evil, wicked, angry, bad</w:t>
       </w:r>
@@ -242,6 +280,7 @@
           <w:numId w:val="1"/>
         </w:numPr>
       </w:pPr>
+      <w:proofErr w:type="spellStart"/>
       <w:r>
         <w:rPr>
           <w:b/>
@@ -249,6 +288,7 @@
         </w:rPr>
         <w:t>vertraulich</w:t>
       </w:r>
+      <w:proofErr w:type="spellEnd"/>
       <w:r>
         <w:t xml:space="preserve"> – adjective/adverb – confidential</w:t>
       </w:r>
@@ -261,6 +301,7 @@
           <w:numId w:val="1"/>
         </w:numPr>
       </w:pPr>
+      <w:proofErr w:type="spellStart"/>
       <w:r>
         <w:rPr>
           <w:b/>
@@ -268,6 +309,7 @@
         </w:rPr>
         <w:t>ebenfalls</w:t>
       </w:r>
+      <w:proofErr w:type="spellEnd"/>
       <w:r>
         <w:t xml:space="preserve"> – adverb – likewise, also, as well, too, equally</w:t>
       </w:r>
@@ -280,6 +322,7 @@
           <w:numId w:val="1"/>
         </w:numPr>
       </w:pPr>
+      <w:proofErr w:type="spellStart"/>
       <w:r>
         <w:rPr>
           <w:b/>
@@ -287,6 +330,7 @@
         </w:rPr>
         <w:t>motivierend</w:t>
       </w:r>
+      <w:proofErr w:type="spellEnd"/>
       <w:r>
         <w:t xml:space="preserve"> – adjective/adverb – motivating, motivational</w:t>
       </w:r>
@@ -299,6 +343,7 @@
           <w:numId w:val="1"/>
         </w:numPr>
       </w:pPr>
+      <w:proofErr w:type="spellStart"/>
       <w:r>
         <w:rPr>
           <w:b/>
@@ -306,6 +351,7 @@
         </w:rPr>
         <w:t>anstrengend</w:t>
       </w:r>
+      <w:proofErr w:type="spellEnd"/>
       <w:r>
         <w:t xml:space="preserve"> – exhausting</w:t>
       </w:r>
@@ -318,6 +364,7 @@
           <w:numId w:val="1"/>
         </w:numPr>
       </w:pPr>
+      <w:proofErr w:type="spellStart"/>
       <w:r>
         <w:rPr>
           <w:b/>
@@ -325,6 +372,7 @@
         </w:rPr>
         <w:t>bedeutend</w:t>
       </w:r>
+      <w:proofErr w:type="spellEnd"/>
       <w:r>
         <w:t xml:space="preserve"> – significant/important</w:t>
       </w:r>
@@ -337,6 +385,7 @@
           <w:numId w:val="1"/>
         </w:numPr>
       </w:pPr>
+      <w:proofErr w:type="spellStart"/>
       <w:r>
         <w:rPr>
           <w:b/>
@@ -344,6 +393,7 @@
         </w:rPr>
         <w:t>bereits</w:t>
       </w:r>
+      <w:proofErr w:type="spellEnd"/>
       <w:r>
         <w:t xml:space="preserve"> – already</w:t>
       </w:r>
@@ -361,10 +411,40 @@
           <w:b/>
           <w:bCs/>
         </w:rPr>
-        <w:t>der Humanismus</w:t>
-      </w:r>
+        <w:t xml:space="preserve">der </w:t>
+      </w:r>
+      <w:proofErr w:type="spellStart"/>
+      <w:r>
+        <w:rPr>
+          <w:b/>
+          <w:bCs/>
+        </w:rPr>
+        <w:t>Humanismus</w:t>
+      </w:r>
+      <w:proofErr w:type="spellEnd"/>
       <w:r>
         <w:t xml:space="preserve"> – humanism</w:t>
+      </w:r>
+    </w:p>
+    <w:p>
+      <w:pPr>
+        <w:pStyle w:val="ListParagraph"/>
+        <w:numPr>
+          <w:ilvl w:val="0"/>
+          <w:numId w:val="1"/>
+        </w:numPr>
+      </w:pPr>
+      <w:proofErr w:type="spellStart"/>
+      <w:r>
+        <w:rPr>
+          <w:b/>
+          <w:bCs/>
+        </w:rPr>
+        <w:t>artig</w:t>
+      </w:r>
+      <w:proofErr w:type="spellEnd"/>
+      <w:r>
+        <w:t xml:space="preserve"> – well-behaved/good</w:t>
       </w:r>
     </w:p>
     <w:sectPr>

</xml_diff>